<commit_message>
chore(repo): prepare for public release
- Refresh README for Round 4: atomic (EIP-7702) engine, depth-aware leg
  sizing, control dashboard + /convert, updated cost model and leg-cap note
- Add Round 4 builder feedback (docs/round-4-feedback.md + reports docx)
- Redact a non-owned wallet address from the analysis reports and docx
- Replace the wallet address in .env.example with a placeholder
- Stop tracking the internal context/ working notes (now gitignored)
</commit_message>
<xml_diff>
--- a/reports/DreamDEX-Findings.docx
+++ b/reports/DreamDEX-Findings.docx
@@ -194,7 +194,7 @@
                 <w:sz w:val="20"/>
                 <w:szCs w:val="20"/>
               </w:rPr>
-              <w:t xml:space="preserve">0xF4c825F3C2970153d78B407CF190861dd4E2b905</w:t>
+              <w:t xml:space="preserve">0x0000000000000000000000000000000000000000</w:t>
             </w:r>
           </w:p>
         </w:tc>
@@ -6670,7 +6670,7 @@
           <w:sz w:val="20"/>
           <w:szCs w:val="20"/>
         </w:rPr>
-        <w:t xml:space="preserve">Report prepared by trader-9 • Wallet 0xF4c825F3C2970153d78B407CF190861dd4E2b905 • Somnia mainnet 5031</w:t>
+        <w:t xml:space="preserve">Report prepared by trader-9 • Wallet 0x0000000000000000000000000000000000000000 • Somnia mainnet 5031</w:t>
       </w:r>
     </w:p>
     <w:sectPr>

</xml_diff>